<commit_message>
ready for draft 1
</commit_message>
<xml_diff>
--- a/TSSSU Annex B - TadReamk Limited (draft).docx
+++ b/TSSSU Annex B - TadReamk Limited (draft).docx
@@ -670,21 +670,12 @@
         </w:rPr>
         <w:t>of </w:t>
       </w:r>
-      <w:proofErr w:type="spellStart"/>
       <w:r>
         <w:rPr>
           <w:rFonts w:ascii="Times New Roman" w:eastAsia="MingLiU" w:hAnsi="Times New Roman"/>
           <w:lang w:val="en-GB"/>
         </w:rPr>
-        <w:t>A</w:t>
-      </w:r>
-      <w:proofErr w:type="spellEnd"/>
-      <w:r>
-        <w:rPr>
-          <w:rFonts w:ascii="Times New Roman" w:eastAsia="MingLiU" w:hAnsi="Times New Roman"/>
-          <w:lang w:val="en-GB"/>
-        </w:rPr>
-        <w:t xml:space="preserve"> any matters relating to the expenditure or custody of any money</w:t>
+        <w:t>A any matters relating to the expenditure or custody of any money</w:t>
       </w:r>
       <w:r>
         <w:rPr>
@@ -1094,9 +1085,9 @@
         <w:tblLook w:val="01E0" w:firstRow="1" w:lastRow="1" w:firstColumn="1" w:lastColumn="1" w:noHBand="0" w:noVBand="0"/>
       </w:tblPr>
       <w:tblGrid>
-        <w:gridCol w:w="3600"/>
+        <w:gridCol w:w="3524"/>
         <w:gridCol w:w="284"/>
-        <w:gridCol w:w="5328"/>
+        <w:gridCol w:w="5219"/>
       </w:tblGrid>
       <w:tr>
         <w:trPr>
@@ -1275,13 +1266,8 @@
             <w:vAlign w:val="bottom"/>
           </w:tcPr>
           <w:p>
-            <w:proofErr w:type="spellStart"/>
-            <w:r>
-              <w:t>TadReamk</w:t>
-            </w:r>
-            <w:proofErr w:type="spellEnd"/>
-            <w:r>
-              <w:t xml:space="preserve"> Limited</w:t>
+            <w:r>
+              <w:t>TadReamk Limited</w:t>
             </w:r>
           </w:p>
         </w:tc>
@@ -1622,7 +1608,22 @@
           </w:tcPr>
           <w:p>
             <w:r>
-              <w:t>HK$499,481.12</w:t>
+              <w:t>HK$</w:t>
+            </w:r>
+            <w:r>
+              <w:t>500</w:t>
+            </w:r>
+            <w:r>
+              <w:t>,</w:t>
+            </w:r>
+            <w:r>
+              <w:t>000</w:t>
+            </w:r>
+            <w:r>
+              <w:t>.</w:t>
+            </w:r>
+            <w:r>
+              <w:t>00</w:t>
             </w:r>
           </w:p>
         </w:tc>
@@ -1726,10 +1727,10 @@
             </w:pPr>
             <w:r>
               <w:rPr>
-                <w:rFonts w:ascii="Times New Roman" w:hAnsi="Times New Roman" w:hint="eastAsia"/>
+                <w:rFonts w:ascii="Times New Roman" w:hAnsi="Times New Roman"/>
                 <w:szCs w:val="24"/>
               </w:rPr>
-              <w:t>HK$</w:t>
+              <w:t>N/A</w:t>
             </w:r>
           </w:p>
         </w:tc>
@@ -1972,59 +1973,23 @@
                 <w:b/>
                 <w:sz w:val="22"/>
               </w:rPr>
-              <w:t>(dd/mm/</w:t>
-            </w:r>
-            <w:proofErr w:type="spellStart"/>
+              <w:t xml:space="preserve">(dd/mm/yyyy </w:t>
+            </w:r>
+            <w:r>
+              <w:rPr>
+                <w:rFonts w:ascii="Times New Roman" w:eastAsia="DFKai-SB" w:hAnsi="Times New Roman"/>
+                <w:b/>
+                <w:sz w:val="22"/>
+              </w:rPr>
+              <w:t>–</w:t>
+            </w:r>
             <w:r>
               <w:rPr>
                 <w:rFonts w:ascii="Times New Roman" w:eastAsia="DFKai-SB" w:hAnsi="Times New Roman" w:hint="eastAsia"/>
                 <w:b/>
                 <w:sz w:val="22"/>
               </w:rPr>
-              <w:t>yyyy</w:t>
-            </w:r>
-            <w:proofErr w:type="spellEnd"/>
-            <w:r>
-              <w:rPr>
-                <w:rFonts w:ascii="Times New Roman" w:eastAsia="DFKai-SB" w:hAnsi="Times New Roman" w:hint="eastAsia"/>
-                <w:b/>
-                <w:sz w:val="22"/>
-              </w:rPr>
-              <w:t xml:space="preserve"> </w:t>
-            </w:r>
-            <w:r>
-              <w:rPr>
-                <w:rFonts w:ascii="Times New Roman" w:eastAsia="DFKai-SB" w:hAnsi="Times New Roman"/>
-                <w:b/>
-                <w:sz w:val="22"/>
-              </w:rPr>
-              <w:t>–</w:t>
-            </w:r>
-            <w:r>
-              <w:rPr>
-                <w:rFonts w:ascii="Times New Roman" w:eastAsia="DFKai-SB" w:hAnsi="Times New Roman" w:hint="eastAsia"/>
-                <w:b/>
-                <w:sz w:val="22"/>
-              </w:rPr>
-              <w:t xml:space="preserve"> dd/mm/</w:t>
-            </w:r>
-            <w:proofErr w:type="spellStart"/>
-            <w:r>
-              <w:rPr>
-                <w:rFonts w:ascii="Times New Roman" w:eastAsia="DFKai-SB" w:hAnsi="Times New Roman" w:hint="eastAsia"/>
-                <w:b/>
-                <w:sz w:val="22"/>
-              </w:rPr>
-              <w:t>yyyy</w:t>
-            </w:r>
-            <w:proofErr w:type="spellEnd"/>
-            <w:r>
-              <w:rPr>
-                <w:rFonts w:ascii="Times New Roman" w:eastAsia="DFKai-SB" w:hAnsi="Times New Roman" w:hint="eastAsia"/>
-                <w:b/>
-                <w:sz w:val="22"/>
-              </w:rPr>
-              <w:t>)</w:t>
+              <w:t xml:space="preserve"> dd/mm/yyyy)</w:t>
             </w:r>
             <w:r>
               <w:rPr>
@@ -2262,7 +2227,7 @@
           </w:tcPr>
           <w:p>
             <w:r>
-              <w:t>Part-time Business Development Manager</w:t>
+              <w:t>Full stack developer</w:t>
             </w:r>
           </w:p>
         </w:tc>
@@ -2296,7 +2261,7 @@
           </w:tcPr>
           <w:p>
             <w:r>
-              <w:t>01/04/2025-31/03/2026</w:t>
+              <w:t>01/04/2025-30/06/2025</w:t>
             </w:r>
           </w:p>
         </w:tc>
@@ -2313,7 +2278,7 @@
           </w:tcPr>
           <w:p>
             <w:r>
-              <w:t>12</w:t>
+              <w:t>3</w:t>
             </w:r>
           </w:p>
         </w:tc>
@@ -2333,7 +2298,19 @@
               <w:jc w:val="right"/>
             </w:pPr>
             <w:r>
-              <w:t>9,600.00</w:t>
+              <w:t>2</w:t>
+            </w:r>
+            <w:r>
+              <w:t>2</w:t>
+            </w:r>
+            <w:r>
+              <w:t>,</w:t>
+            </w:r>
+            <w:r>
+              <w:t>00</w:t>
+            </w:r>
+            <w:r>
+              <w:t>0.00</w:t>
             </w:r>
           </w:p>
         </w:tc>
@@ -2353,7 +2330,19 @@
               <w:jc w:val="right"/>
             </w:pPr>
             <w:r>
-              <w:t>115,200.00</w:t>
+              <w:t>6</w:t>
+            </w:r>
+            <w:r>
+              <w:t>6</w:t>
+            </w:r>
+            <w:r>
+              <w:t>,</w:t>
+            </w:r>
+            <w:r>
+              <w:t>00</w:t>
+            </w:r>
+            <w:r>
+              <w:t>0.00</w:t>
             </w:r>
           </w:p>
         </w:tc>
@@ -2375,7 +2364,7 @@
           </w:tcPr>
           <w:p>
             <w:r>
-              <w:t>MPF to Part-time Business Development Manager</w:t>
+              <w:t>MPF to Full stack developer</w:t>
             </w:r>
           </w:p>
         </w:tc>
@@ -2409,7 +2398,7 @@
           </w:tcPr>
           <w:p>
             <w:r>
-              <w:t>01/04/2025-31/03/2026</w:t>
+              <w:t>01/04/2025-30/06/2025</w:t>
             </w:r>
           </w:p>
         </w:tc>
@@ -2426,7 +2415,7 @@
           </w:tcPr>
           <w:p>
             <w:r>
-              <w:t>12</w:t>
+              <w:t>3</w:t>
             </w:r>
           </w:p>
         </w:tc>
@@ -2446,7 +2435,19 @@
               <w:jc w:val="right"/>
             </w:pPr>
             <w:r>
-              <w:t>480.00</w:t>
+              <w:t>1,</w:t>
+            </w:r>
+            <w:r>
+              <w:t>10</w:t>
+            </w:r>
+            <w:r>
+              <w:t>0.</w:t>
+            </w:r>
+            <w:r>
+              <w:t>0</w:t>
+            </w:r>
+            <w:r>
+              <w:t>0</w:t>
             </w:r>
           </w:p>
         </w:tc>
@@ -2466,7 +2467,19 @@
               <w:jc w:val="right"/>
             </w:pPr>
             <w:r>
-              <w:t>5,760.00</w:t>
+              <w:t>3,</w:t>
+            </w:r>
+            <w:r>
+              <w:t>300</w:t>
+            </w:r>
+            <w:r>
+              <w:t>.</w:t>
+            </w:r>
+            <w:r>
+              <w:t>0</w:t>
+            </w:r>
+            <w:r>
+              <w:t>0</w:t>
             </w:r>
           </w:p>
         </w:tc>
@@ -2488,7 +2501,10 @@
           </w:tcPr>
           <w:p>
             <w:r>
-              <w:t>Full stack developer</w:t>
+              <w:t xml:space="preserve">Machine Learning </w:t>
+            </w:r>
+            <w:r>
+              <w:t>Researcher</w:t>
             </w:r>
           </w:p>
         </w:tc>
@@ -2522,7 +2538,7 @@
           </w:tcPr>
           <w:p>
             <w:r>
-              <w:t>01/04/2025-30/06/2025</w:t>
+              <w:t>01/09/2025-31/12/2025</w:t>
             </w:r>
           </w:p>
         </w:tc>
@@ -2539,7 +2555,7 @@
           </w:tcPr>
           <w:p>
             <w:r>
-              <w:t>3</w:t>
+              <w:t>4</w:t>
             </w:r>
           </w:p>
         </w:tc>
@@ -2559,7 +2575,7 @@
               <w:jc w:val="right"/>
             </w:pPr>
             <w:r>
-              <w:t>21,730.00</w:t>
+              <w:t>18,000.00</w:t>
             </w:r>
           </w:p>
         </w:tc>
@@ -2579,7 +2595,7 @@
               <w:jc w:val="right"/>
             </w:pPr>
             <w:r>
-              <w:t>65,190.00</w:t>
+              <w:t>72,000.00</w:t>
             </w:r>
           </w:p>
         </w:tc>
@@ -2601,7 +2617,13 @@
           </w:tcPr>
           <w:p>
             <w:r>
-              <w:t>MPF to Full stack developer</w:t>
+              <w:t xml:space="preserve">MPF to </w:t>
+            </w:r>
+            <w:r>
+              <w:t xml:space="preserve">Machine Learning </w:t>
+            </w:r>
+            <w:r>
+              <w:t>Researcher</w:t>
             </w:r>
           </w:p>
         </w:tc>
@@ -2635,7 +2657,7 @@
           </w:tcPr>
           <w:p>
             <w:r>
-              <w:t>01/04/2025-30/06/2025</w:t>
+              <w:t>01/09/2025-31/12/2025</w:t>
             </w:r>
           </w:p>
         </w:tc>
@@ -2652,7 +2674,7 @@
           </w:tcPr>
           <w:p>
             <w:r>
-              <w:t>3</w:t>
+              <w:t>4</w:t>
             </w:r>
           </w:p>
         </w:tc>
@@ -2672,7 +2694,7 @@
               <w:jc w:val="right"/>
             </w:pPr>
             <w:r>
-              <w:t>1,086.50</w:t>
+              <w:t>900.00</w:t>
             </w:r>
           </w:p>
         </w:tc>
@@ -2692,7 +2714,7 @@
               <w:jc w:val="right"/>
             </w:pPr>
             <w:r>
-              <w:t>3,259.50</w:t>
+              <w:t>3,600.00</w:t>
             </w:r>
           </w:p>
         </w:tc>
@@ -2714,7 +2736,13 @@
           </w:tcPr>
           <w:p>
             <w:r>
-              <w:t>Researcher</w:t>
+              <w:t>Pa</w:t>
+            </w:r>
+            <w:r>
+              <w:t>rt-time Business Development</w:t>
+            </w:r>
+            <w:r>
+              <w:t xml:space="preserve"> Manager</w:t>
             </w:r>
           </w:p>
         </w:tc>
@@ -2748,11 +2776,7 @@
           </w:tcPr>
           <w:p>
             <w:r>
-              <w:t>01/09/2025-31</w:t>
-            </w:r>
-            <w:r>
-              <w:lastRenderedPageBreak/>
-              <w:t>/12/2025</w:t>
+              <w:t>01/04/2025-31/03/2026</w:t>
             </w:r>
           </w:p>
         </w:tc>
@@ -2769,8 +2793,7 @@
           </w:tcPr>
           <w:p>
             <w:r>
-              <w:lastRenderedPageBreak/>
-              <w:t>4</w:t>
+              <w:t>12</w:t>
             </w:r>
           </w:p>
         </w:tc>
@@ -2790,7 +2813,7 @@
               <w:jc w:val="right"/>
             </w:pPr>
             <w:r>
-              <w:t>18,000.00</w:t>
+              <w:t>10,000.00</w:t>
             </w:r>
           </w:p>
         </w:tc>
@@ -2810,7 +2833,7 @@
               <w:jc w:val="right"/>
             </w:pPr>
             <w:r>
-              <w:t>72,000.00</w:t>
+              <w:t>120,000.00</w:t>
             </w:r>
           </w:p>
         </w:tc>
@@ -2832,7 +2855,11 @@
           </w:tcPr>
           <w:p>
             <w:r>
-              <w:t>MPF to Researcher</w:t>
+              <w:t xml:space="preserve">MPF to Part-time </w:t>
+            </w:r>
+            <w:r>
+              <w:lastRenderedPageBreak/>
+              <w:t>Business Development Manager</w:t>
             </w:r>
           </w:p>
         </w:tc>
@@ -2849,6 +2876,7 @@
           </w:tcPr>
           <w:p>
             <w:r>
+              <w:lastRenderedPageBreak/>
               <w:t>1</w:t>
             </w:r>
           </w:p>
@@ -2866,7 +2894,11 @@
           </w:tcPr>
           <w:p>
             <w:r>
-              <w:t>01/09/2025-31/12/2025</w:t>
+              <w:t>01/04/2025-</w:t>
+            </w:r>
+            <w:r>
+              <w:lastRenderedPageBreak/>
+              <w:t>31/03/2026</w:t>
             </w:r>
           </w:p>
         </w:tc>
@@ -2883,7 +2915,8 @@
           </w:tcPr>
           <w:p>
             <w:r>
-              <w:t>4</w:t>
+              <w:lastRenderedPageBreak/>
+              <w:t>12</w:t>
             </w:r>
           </w:p>
         </w:tc>
@@ -2903,7 +2936,7 @@
               <w:jc w:val="right"/>
             </w:pPr>
             <w:r>
-              <w:t>900.00</w:t>
+              <w:t>500.00</w:t>
             </w:r>
           </w:p>
         </w:tc>
@@ -2923,7 +2956,7 @@
               <w:jc w:val="right"/>
             </w:pPr>
             <w:r>
-              <w:t>3,600.00</w:t>
+              <w:t>6,000.00</w:t>
             </w:r>
           </w:p>
         </w:tc>
@@ -3016,7 +3049,19 @@
               <w:jc w:val="right"/>
             </w:pPr>
             <w:r>
-              <w:t>6,745.60</w:t>
+              <w:t>6,</w:t>
+            </w:r>
+            <w:r>
+              <w:t>960</w:t>
+            </w:r>
+            <w:r>
+              <w:t>.</w:t>
+            </w:r>
+            <w:r>
+              <w:t>0</w:t>
+            </w:r>
+            <w:r>
+              <w:t>0</w:t>
             </w:r>
           </w:p>
         </w:tc>
@@ -3036,7 +3081,25 @@
               <w:jc w:val="right"/>
             </w:pPr>
             <w:r>
-              <w:t>26,982.40</w:t>
+              <w:t>2</w:t>
+            </w:r>
+            <w:r>
+              <w:t>7</w:t>
+            </w:r>
+            <w:r>
+              <w:t>,8</w:t>
+            </w:r>
+            <w:r>
+              <w:t>40</w:t>
+            </w:r>
+            <w:r>
+              <w:t>.</w:t>
+            </w:r>
+            <w:r>
+              <w:t>0</w:t>
+            </w:r>
+            <w:r>
+              <w:t>0</w:t>
             </w:r>
           </w:p>
         </w:tc>
@@ -3129,7 +3192,16 @@
               <w:jc w:val="right"/>
             </w:pPr>
             <w:r>
-              <w:t>337.28</w:t>
+              <w:t>3</w:t>
+            </w:r>
+            <w:r>
+              <w:t>48</w:t>
+            </w:r>
+            <w:r>
+              <w:t>.</w:t>
+            </w:r>
+            <w:r>
+              <w:t>00</w:t>
             </w:r>
           </w:p>
         </w:tc>
@@ -3149,7 +3221,26 @@
               <w:jc w:val="right"/>
             </w:pPr>
             <w:r>
-              <w:t>1,349.12</w:t>
+              <w:t>1,3</w:t>
+            </w:r>
+            <w:del w:id="0" w:author="Henry Fung" w:date="2026-05-28T14:49:00Z" w16du:dateUtc="2026-05-28T06:49:00Z">
+              <w:r>
+                <w:delText>4</w:delText>
+              </w:r>
+            </w:del>
+            <w:r>
+              <w:t>9</w:t>
+            </w:r>
+            <w:ins w:id="1" w:author="Henry Fung" w:date="2026-05-28T14:49:00Z" w16du:dateUtc="2026-05-28T06:49:00Z">
+              <w:r>
+                <w:t>2</w:t>
+              </w:r>
+            </w:ins>
+            <w:r>
+              <w:t>.</w:t>
+            </w:r>
+            <w:r>
+              <w:t>00</w:t>
             </w:r>
           </w:p>
         </w:tc>
@@ -3525,7 +3616,22 @@
               <w:jc w:val="right"/>
             </w:pPr>
             <w:r>
-              <w:t>302,239.77</w:t>
+              <w:t>30</w:t>
+            </w:r>
+            <w:r>
+              <w:t>9</w:t>
+            </w:r>
+            <w:r>
+              <w:t>,</w:t>
+            </w:r>
+            <w:r>
+              <w:t>030</w:t>
+            </w:r>
+            <w:r>
+              <w:t>.7</w:t>
+            </w:r>
+            <w:r>
+              <w:t>5</w:t>
             </w:r>
           </w:p>
         </w:tc>
@@ -3933,25 +4039,7 @@
                 <w:b/>
                 <w:sz w:val="22"/>
               </w:rPr>
-              <w:t>(dd/mm/</w:t>
-            </w:r>
-            <w:proofErr w:type="spellStart"/>
-            <w:r>
-              <w:rPr>
-                <w:rFonts w:ascii="Times New Roman" w:eastAsia="DFKai-SB" w:hAnsi="Times New Roman" w:hint="eastAsia"/>
-                <w:b/>
-                <w:sz w:val="22"/>
-              </w:rPr>
-              <w:t>yyyy</w:t>
-            </w:r>
-            <w:proofErr w:type="spellEnd"/>
-            <w:r>
-              <w:rPr>
-                <w:rFonts w:ascii="Times New Roman" w:eastAsia="DFKai-SB" w:hAnsi="Times New Roman" w:hint="eastAsia"/>
-                <w:b/>
-                <w:sz w:val="22"/>
-              </w:rPr>
-              <w:t>)</w:t>
+              <w:t>(dd/mm/yyyy)</w:t>
             </w:r>
           </w:p>
         </w:tc>
@@ -4102,11 +4190,7 @@
             </w:tcBorders>
             <w:vAlign w:val="center"/>
           </w:tcPr>
-          <w:p>
-            <w:r>
-              <w:t>Multi-purpose GPU server (New Purchase)</w:t>
-            </w:r>
-          </w:p>
+          <w:p/>
         </w:tc>
         <w:tc>
           <w:tcPr>
@@ -4120,9 +4204,11 @@
             <w:vAlign w:val="center"/>
           </w:tcPr>
           <w:p>
-            <w:r>
-              <w:t>1</w:t>
-            </w:r>
+            <w:del w:id="2" w:author="Henry Fung" w:date="2026-05-28T14:57:00Z" w16du:dateUtc="2026-05-28T06:57:00Z">
+              <w:r>
+                <w:delText>1</w:delText>
+              </w:r>
+            </w:del>
           </w:p>
         </w:tc>
         <w:tc>
@@ -4136,11 +4222,7 @@
             </w:tcBorders>
             <w:vAlign w:val="center"/>
           </w:tcPr>
-          <w:p>
-            <w:r>
-              <w:t>13/03/2026</w:t>
-            </w:r>
-          </w:p>
+          <w:p/>
         </w:tc>
         <w:tc>
           <w:tcPr>
@@ -4157,9 +4239,6 @@
             <w:pPr>
               <w:jc w:val="right"/>
             </w:pPr>
-            <w:r>
-              <w:t>52,094.00</w:t>
-            </w:r>
           </w:p>
         </w:tc>
         <w:tc>
@@ -4177,9 +4256,6 @@
             <w:pPr>
               <w:jc w:val="right"/>
             </w:pPr>
-            <w:r>
-              <w:t>52,094.00</w:t>
-            </w:r>
           </w:p>
         </w:tc>
       </w:tr>
@@ -4373,6 +4449,103 @@
             </w:pPr>
             <w:r>
               <w:t>18,313.43</w:t>
+            </w:r>
+          </w:p>
+        </w:tc>
+      </w:tr>
+      <w:tr>
+        <w:trPr>
+          <w:cantSplit/>
+          <w:jc w:val="center"/>
+        </w:trPr>
+        <w:tc>
+          <w:tcPr>
+            <w:tcW w:w="2808" w:type="dxa"/>
+            <w:tcBorders>
+              <w:top w:val="single" w:sz="4" w:space="0" w:color="auto"/>
+              <w:left w:val="single" w:sz="4" w:space="0" w:color="auto"/>
+              <w:bottom w:val="single" w:sz="4" w:space="0" w:color="auto"/>
+              <w:right w:val="single" w:sz="4" w:space="0" w:color="auto"/>
+            </w:tcBorders>
+            <w:vAlign w:val="center"/>
+          </w:tcPr>
+          <w:p>
+            <w:r>
+              <w:t>Computation and Rendering Server (New Purchase)</w:t>
+            </w:r>
+          </w:p>
+        </w:tc>
+        <w:tc>
+          <w:tcPr>
+            <w:tcW w:w="1152" w:type="dxa"/>
+            <w:tcBorders>
+              <w:top w:val="single" w:sz="4" w:space="0" w:color="auto"/>
+              <w:left w:val="single" w:sz="4" w:space="0" w:color="auto"/>
+              <w:bottom w:val="single" w:sz="4" w:space="0" w:color="auto"/>
+              <w:right w:val="single" w:sz="4" w:space="0" w:color="auto"/>
+            </w:tcBorders>
+            <w:vAlign w:val="center"/>
+          </w:tcPr>
+          <w:p>
+            <w:r>
+              <w:t>1</w:t>
+            </w:r>
+          </w:p>
+        </w:tc>
+        <w:tc>
+          <w:tcPr>
+            <w:tcW w:w="1584" w:type="dxa"/>
+            <w:tcBorders>
+              <w:top w:val="single" w:sz="4" w:space="0" w:color="auto"/>
+              <w:left w:val="single" w:sz="4" w:space="0" w:color="auto"/>
+              <w:bottom w:val="single" w:sz="4" w:space="0" w:color="auto"/>
+              <w:right w:val="single" w:sz="4" w:space="0" w:color="auto"/>
+            </w:tcBorders>
+            <w:vAlign w:val="center"/>
+          </w:tcPr>
+          <w:p>
+            <w:r>
+              <w:t>13/03/2026</w:t>
+            </w:r>
+          </w:p>
+        </w:tc>
+        <w:tc>
+          <w:tcPr>
+            <w:tcW w:w="1872" w:type="dxa"/>
+            <w:tcBorders>
+              <w:top w:val="single" w:sz="4" w:space="0" w:color="auto"/>
+              <w:left w:val="single" w:sz="4" w:space="0" w:color="auto"/>
+              <w:bottom w:val="single" w:sz="4" w:space="0" w:color="auto"/>
+              <w:right w:val="single" w:sz="4" w:space="0" w:color="auto"/>
+            </w:tcBorders>
+            <w:vAlign w:val="center"/>
+          </w:tcPr>
+          <w:p>
+            <w:pPr>
+              <w:jc w:val="right"/>
+            </w:pPr>
+            <w:r>
+              <w:t>52,094.00</w:t>
+            </w:r>
+          </w:p>
+        </w:tc>
+        <w:tc>
+          <w:tcPr>
+            <w:tcW w:w="1872" w:type="dxa"/>
+            <w:tcBorders>
+              <w:top w:val="single" w:sz="4" w:space="0" w:color="auto"/>
+              <w:left w:val="single" w:sz="4" w:space="0" w:color="auto"/>
+              <w:bottom w:val="single" w:sz="4" w:space="0" w:color="auto"/>
+              <w:right w:val="single" w:sz="4" w:space="0" w:color="auto"/>
+            </w:tcBorders>
+            <w:vAlign w:val="center"/>
+          </w:tcPr>
+          <w:p>
+            <w:pPr>
+              <w:jc w:val="right"/>
+            </w:pPr>
+            <w:r>
+              <w:t>52,094.00</w:t>
             </w:r>
           </w:p>
         </w:tc>
@@ -4919,7 +5092,7 @@
           </w:tcPr>
           <w:p>
             <w:r>
-              <w:t>1</w:t>
+              <w:t>6 orders</w:t>
             </w:r>
           </w:p>
         </w:tc>
@@ -4939,7 +5112,25 @@
               <w:jc w:val="right"/>
             </w:pPr>
             <w:r>
-              <w:t>25,922.19</w:t>
+              <w:t>4</w:t>
+            </w:r>
+            <w:r>
+              <w:t>,</w:t>
+            </w:r>
+            <w:r>
+              <w:t>3</w:t>
+            </w:r>
+            <w:r>
+              <w:t>2</w:t>
+            </w:r>
+            <w:r>
+              <w:t>0</w:t>
+            </w:r>
+            <w:r>
+              <w:t>.</w:t>
+            </w:r>
+            <w:r>
+              <w:t>37</w:t>
             </w:r>
           </w:p>
         </w:tc>
@@ -4999,7 +5190,7 @@
           </w:tcPr>
           <w:p>
             <w:r>
-              <w:t>1</w:t>
+              <w:t>2</w:t>
             </w:r>
           </w:p>
         </w:tc>
@@ -5019,7 +5210,16 @@
               <w:jc w:val="right"/>
             </w:pPr>
             <w:r>
-              <w:t>26,000.00</w:t>
+              <w:t>18</w:t>
+            </w:r>
+            <w:r>
+              <w:t>,</w:t>
+            </w:r>
+            <w:r>
+              <w:t>425</w:t>
+            </w:r>
+            <w:r>
+              <w:t>.00</w:t>
             </w:r>
           </w:p>
         </w:tc>
@@ -5039,87 +5239,16 @@
               <w:jc w:val="right"/>
             </w:pPr>
             <w:r>
-              <w:t>26,000.00</w:t>
-            </w:r>
-          </w:p>
-        </w:tc>
-      </w:tr>
-      <w:tr>
-        <w:trPr>
-          <w:cantSplit/>
-          <w:jc w:val="center"/>
-        </w:trPr>
-        <w:tc>
-          <w:tcPr>
-            <w:tcW w:w="4392" w:type="dxa"/>
-            <w:tcBorders>
-              <w:top w:val="single" w:sz="4" w:space="0" w:color="auto"/>
-              <w:left w:val="single" w:sz="4" w:space="0" w:color="auto"/>
-              <w:bottom w:val="single" w:sz="4" w:space="0" w:color="auto"/>
-              <w:right w:val="single" w:sz="4" w:space="0" w:color="auto"/>
-            </w:tcBorders>
-            <w:vAlign w:val="center"/>
-          </w:tcPr>
-          <w:p>
-            <w:r>
-              <w:t>Exhibitions</w:t>
-            </w:r>
-          </w:p>
-        </w:tc>
-        <w:tc>
-          <w:tcPr>
-            <w:tcW w:w="1152" w:type="dxa"/>
-            <w:tcBorders>
-              <w:top w:val="single" w:sz="4" w:space="0" w:color="auto"/>
-              <w:left w:val="single" w:sz="4" w:space="0" w:color="auto"/>
-              <w:bottom w:val="single" w:sz="4" w:space="0" w:color="auto"/>
-              <w:right w:val="single" w:sz="4" w:space="0" w:color="auto"/>
-            </w:tcBorders>
-            <w:vAlign w:val="center"/>
-          </w:tcPr>
-          <w:p>
-            <w:r>
-              <w:t>1</w:t>
-            </w:r>
-          </w:p>
-        </w:tc>
-        <w:tc>
-          <w:tcPr>
-            <w:tcW w:w="1872" w:type="dxa"/>
-            <w:tcBorders>
-              <w:top w:val="single" w:sz="4" w:space="0" w:color="auto"/>
-              <w:left w:val="single" w:sz="4" w:space="0" w:color="auto"/>
-              <w:bottom w:val="single" w:sz="4" w:space="0" w:color="auto"/>
-              <w:right w:val="single" w:sz="4" w:space="0" w:color="auto"/>
-            </w:tcBorders>
-            <w:vAlign w:val="center"/>
-          </w:tcPr>
-          <w:p>
-            <w:pPr>
-              <w:jc w:val="right"/>
-            </w:pPr>
-            <w:r>
-              <w:t>10,850.00</w:t>
-            </w:r>
-          </w:p>
-        </w:tc>
-        <w:tc>
-          <w:tcPr>
-            <w:tcW w:w="1872" w:type="dxa"/>
-            <w:tcBorders>
-              <w:top w:val="single" w:sz="4" w:space="0" w:color="auto"/>
-              <w:left w:val="single" w:sz="4" w:space="0" w:color="auto"/>
-              <w:bottom w:val="single" w:sz="4" w:space="0" w:color="auto"/>
-              <w:right w:val="single" w:sz="4" w:space="0" w:color="auto"/>
-            </w:tcBorders>
-            <w:vAlign w:val="center"/>
-          </w:tcPr>
-          <w:p>
-            <w:pPr>
-              <w:jc w:val="right"/>
-            </w:pPr>
-            <w:r>
-              <w:t>10,850.00</w:t>
+              <w:t>3</w:t>
+            </w:r>
+            <w:r>
+              <w:t>6,</w:t>
+            </w:r>
+            <w:r>
+              <w:t>85</w:t>
+            </w:r>
+            <w:r>
+              <w:t>0.00</w:t>
             </w:r>
           </w:p>
         </w:tc>
@@ -5238,12 +5367,10 @@
           <w:szCs w:val="24"/>
         </w:rPr>
         <w:sectPr>
-          <w:headerReference w:type="even" r:id="rId11"/>
-          <w:headerReference w:type="default" r:id="rId12"/>
-          <w:footerReference w:type="even" r:id="rId13"/>
-          <w:footerReference w:type="default" r:id="rId14"/>
-          <w:headerReference w:type="first" r:id="rId15"/>
-          <w:footerReference w:type="first" r:id="rId16"/>
+          <w:headerReference w:type="default" r:id="rId11"/>
+          <w:footerReference w:type="default" r:id="rId12"/>
+          <w:headerReference w:type="first" r:id="rId13"/>
+          <w:footerReference w:type="first" r:id="rId14"/>
           <w:pgSz w:w="11907" w:h="16840" w:code="9"/>
           <w:pgMar w:top="1440" w:right="1440" w:bottom="1440" w:left="1440" w:header="720" w:footer="720" w:gutter="0"/>
           <w:cols w:space="720"/>
@@ -5461,21 +5588,12 @@
         </w:rPr>
         <w:t xml:space="preserve"> named in Section </w:t>
       </w:r>
-      <w:proofErr w:type="gramStart"/>
       <w:r>
         <w:rPr>
           <w:rFonts w:ascii="Times New Roman" w:hAnsi="Times New Roman" w:hint="eastAsia"/>
           <w:szCs w:val="24"/>
         </w:rPr>
-        <w:t>A;</w:t>
-      </w:r>
-      <w:proofErr w:type="gramEnd"/>
-      <w:r>
-        <w:rPr>
-          <w:rFonts w:ascii="Times New Roman" w:hAnsi="Times New Roman" w:hint="eastAsia"/>
-          <w:szCs w:val="24"/>
-        </w:rPr>
-        <w:t xml:space="preserve"> </w:t>
+        <w:t xml:space="preserve">A; </w:t>
       </w:r>
     </w:p>
     <w:p>
@@ -5894,23 +6012,7 @@
           <w:rFonts w:ascii="Times New Roman" w:hAnsi="Times New Roman" w:hint="eastAsia"/>
           <w:szCs w:val="24"/>
         </w:rPr>
-        <w:t xml:space="preserve">vernment or a Government </w:t>
-      </w:r>
-      <w:proofErr w:type="spellStart"/>
-      <w:r>
-        <w:rPr>
-          <w:rFonts w:ascii="Times New Roman" w:hAnsi="Times New Roman" w:hint="eastAsia"/>
-          <w:szCs w:val="24"/>
-        </w:rPr>
-        <w:t>subvented</w:t>
-      </w:r>
-      <w:proofErr w:type="spellEnd"/>
-      <w:r>
-        <w:rPr>
-          <w:rFonts w:ascii="Times New Roman" w:hAnsi="Times New Roman" w:hint="eastAsia"/>
-          <w:szCs w:val="24"/>
-        </w:rPr>
-        <w:t xml:space="preserve"> body/institution or the university</w:t>
+        <w:t>vernment or a Government subvented body/institution or the university</w:t>
       </w:r>
       <w:r>
         <w:rPr>
@@ -6252,13 +6354,8 @@
             <w:vAlign w:val="bottom"/>
           </w:tcPr>
           <w:p>
-            <w:proofErr w:type="spellStart"/>
-            <w:r>
-              <w:t>TadReamk</w:t>
-            </w:r>
-            <w:proofErr w:type="spellEnd"/>
-            <w:r>
-              <w:t xml:space="preserve"> Limited</w:t>
+            <w:r>
+              <w:t>TadReamk Limited</w:t>
             </w:r>
           </w:p>
         </w:tc>
@@ -6329,31 +6426,15 @@
                 <w:szCs w:val="26"/>
               </w:rPr>
             </w:pPr>
-            <w:commentRangeStart w:id="0"/>
+            <w:commentRangeStart w:id="3"/>
             <w:r>
               <w:rPr>
                 <w:rFonts w:ascii="Times New Roman" w:eastAsia="MingLiU" w:hAnsi="Times New Roman"/>
                 <w:szCs w:val="26"/>
               </w:rPr>
-              <w:t>Date (dd/mm/</w:t>
-            </w:r>
-            <w:proofErr w:type="spellStart"/>
-            <w:r>
-              <w:rPr>
-                <w:rFonts w:ascii="Times New Roman" w:eastAsia="MingLiU" w:hAnsi="Times New Roman"/>
-                <w:szCs w:val="26"/>
-              </w:rPr>
-              <w:t>yy</w:t>
-            </w:r>
-            <w:proofErr w:type="spellEnd"/>
-            <w:r>
-              <w:rPr>
-                <w:rFonts w:ascii="Times New Roman" w:eastAsia="MingLiU" w:hAnsi="Times New Roman"/>
-                <w:szCs w:val="26"/>
-              </w:rPr>
-              <w:t>)</w:t>
-            </w:r>
-            <w:commentRangeEnd w:id="0"/>
+              <w:t>Date (dd/mm/yy)</w:t>
+            </w:r>
+            <w:commentRangeEnd w:id="3"/>
             <w:r>
               <w:rPr>
                 <w:rStyle w:val="af1"/>
@@ -6361,7 +6442,7 @@
                 <w:sz w:val="24"/>
                 <w:szCs w:val="26"/>
               </w:rPr>
-              <w:commentReference w:id="0"/>
+              <w:commentReference w:id="3"/>
             </w:r>
           </w:p>
         </w:tc>
@@ -8142,7 +8223,7 @@
       </w:pPr>
     </w:p>
     <w:sectPr>
-      <w:footerReference w:type="default" r:id="rId21"/>
+      <w:footerReference w:type="default" r:id="rId19"/>
       <w:type w:val="continuous"/>
       <w:pgSz w:w="11907" w:h="16840" w:code="9"/>
       <w:pgMar w:top="1440" w:right="1440" w:bottom="1440" w:left="1440" w:header="720" w:footer="720" w:gutter="0"/>
@@ -8157,7 +8238,7 @@
 
 <file path=word/comments.xml><?xml version="1.0" encoding="utf-8"?>
 <w:comments xmlns:wpc="http://schemas.microsoft.com/office/word/2010/wordprocessingCanvas" xmlns:cx="http://schemas.microsoft.com/office/drawing/2014/chartex" xmlns:cx1="http://schemas.microsoft.com/office/drawing/2015/9/8/chartex" xmlns:cx2="http://schemas.microsoft.com/office/drawing/2015/10/21/chartex" xmlns:cx3="http://schemas.microsoft.com/office/drawing/2016/5/9/chartex" xmlns:cx4="http://schemas.microsoft.com/office/drawing/2016/5/10/chartex" xmlns:cx5="http://schemas.microsoft.com/office/drawing/2016/5/11/chartex" xmlns:cx6="http://schemas.microsoft.com/office/drawing/2016/5/12/chartex" xmlns:cx7="http://schemas.microsoft.com/office/drawing/2016/5/13/chartex" xmlns:cx8="http://schemas.microsoft.com/office/drawing/2016/5/14/chartex" xmlns:mc="http://schemas.openxmlformats.org/markup-compatibility/2006" xmlns:aink="http://schemas.microsoft.com/office/drawing/2016/ink" xmlns:am3d="http://schemas.microsoft.com/office/drawing/2017/model3d" xmlns:o="urn:schemas-microsoft-com:office:office" xmlns:oel="http://schemas.microsoft.com/office/2019/extlst" xmlns:r="http://schemas.openxmlformats.org/officeDocument/2006/relationships" xmlns:m="http://schemas.openxmlformats.org/officeDocument/2006/math" xmlns:v="urn:schemas-microsoft-com:vml" xmlns:wp14="http://schemas.microsoft.com/office/word/2010/wordprocessingDrawing" xmlns:wp="http://schemas.openxmlformats.org/drawingml/2006/wordprocessingDrawing" xmlns:w10="urn:schemas-microsoft-com:office:word" xmlns:w="http://schemas.openxmlformats.org/wordprocessingml/2006/main" xmlns:w14="http://schemas.microsoft.com/office/word/2010/wordml" xmlns:w15="http://schemas.microsoft.com/office/word/2012/wordml" xmlns:w16cex="http://schemas.microsoft.com/office/word/2018/wordml/cex" xmlns:w16cid="http://schemas.microsoft.com/office/word/2016/wordml/cid" xmlns:w16="http://schemas.microsoft.com/office/word/2018/wordml" xmlns:w16du="http://schemas.microsoft.com/office/word/2023/wordml/word16du" xmlns:w16sdtdh="http://schemas.microsoft.com/office/word/2020/wordml/sdtdatahash" xmlns:w16sdtfl="http://schemas.microsoft.com/office/word/2024/wordml/sdtformatlock" xmlns:w16se="http://schemas.microsoft.com/office/word/2015/wordml/symex" xmlns:wpg="http://schemas.microsoft.com/office/word/2010/wordprocessingGroup" xmlns:wpi="http://schemas.microsoft.com/office/word/2010/wordprocessingInk" xmlns:wne="http://schemas.microsoft.com/office/word/2006/wordml" xmlns:wps="http://schemas.microsoft.com/office/word/2010/wordprocessingShape" mc:Ignorable="w14 w15 w16se w16cid w16 w16cex w16sdtdh w16sdtfl w16du wp14">
-  <w:comment w:id="0" w:author="Jervin NG" w:date="2026-03-13T18:32:00Z" w:initials="JN">
+  <w:comment w:id="3" w:author="Jervin NG" w:date="2026-03-13T18:32:00Z" w:initials="JN">
     <w:p>
       <w:pPr>
         <w:pStyle w:val="af2"/>
@@ -8184,7 +8265,7 @@
 
 <file path=word/commentsExtended.xml><?xml version="1.0" encoding="utf-8"?>
 <w15:commentsEx xmlns:wpc="http://schemas.microsoft.com/office/word/2010/wordprocessingCanvas" xmlns:cx="http://schemas.microsoft.com/office/drawing/2014/chartex" xmlns:cx1="http://schemas.microsoft.com/office/drawing/2015/9/8/chartex" xmlns:cx2="http://schemas.microsoft.com/office/drawing/2015/10/21/chartex" xmlns:cx3="http://schemas.microsoft.com/office/drawing/2016/5/9/chartex" xmlns:cx4="http://schemas.microsoft.com/office/drawing/2016/5/10/chartex" xmlns:cx5="http://schemas.microsoft.com/office/drawing/2016/5/11/chartex" xmlns:cx6="http://schemas.microsoft.com/office/drawing/2016/5/12/chartex" xmlns:cx7="http://schemas.microsoft.com/office/drawing/2016/5/13/chartex" xmlns:cx8="http://schemas.microsoft.com/office/drawing/2016/5/14/chartex" xmlns:mc="http://schemas.openxmlformats.org/markup-compatibility/2006" xmlns:aink="http://schemas.microsoft.com/office/drawing/2016/ink" xmlns:am3d="http://schemas.microsoft.com/office/drawing/2017/model3d" xmlns:o="urn:schemas-microsoft-com:office:office" xmlns:oel="http://schemas.microsoft.com/office/2019/extlst" xmlns:r="http://schemas.openxmlformats.org/officeDocument/2006/relationships" xmlns:m="http://schemas.openxmlformats.org/officeDocument/2006/math" xmlns:v="urn:schemas-microsoft-com:vml" xmlns:wp14="http://schemas.microsoft.com/office/word/2010/wordprocessingDrawing" xmlns:wp="http://schemas.openxmlformats.org/drawingml/2006/wordprocessingDrawing" xmlns:w10="urn:schemas-microsoft-com:office:word" xmlns:w="http://schemas.openxmlformats.org/wordprocessingml/2006/main" xmlns:w14="http://schemas.microsoft.com/office/word/2010/wordml" xmlns:w15="http://schemas.microsoft.com/office/word/2012/wordml" xmlns:w16cex="http://schemas.microsoft.com/office/word/2018/wordml/cex" xmlns:w16cid="http://schemas.microsoft.com/office/word/2016/wordml/cid" xmlns:w16="http://schemas.microsoft.com/office/word/2018/wordml" xmlns:w16du="http://schemas.microsoft.com/office/word/2023/wordml/word16du" xmlns:w16sdtdh="http://schemas.microsoft.com/office/word/2020/wordml/sdtdatahash" xmlns:w16sdtfl="http://schemas.microsoft.com/office/word/2024/wordml/sdtformatlock" xmlns:w16se="http://schemas.microsoft.com/office/word/2015/wordml/symex" xmlns:wpg="http://schemas.microsoft.com/office/word/2010/wordprocessingGroup" xmlns:wpi="http://schemas.microsoft.com/office/word/2010/wordprocessingInk" xmlns:wne="http://schemas.microsoft.com/office/word/2006/wordml" xmlns:wps="http://schemas.microsoft.com/office/word/2010/wordprocessingShape" mc:Ignorable="w14 w15 w16se w16cid w16 w16cex w16sdtdh w16sdtfl w16du wp14">
-  <w15:commentEx w15:paraId="272051E5" w15:done="0"/>
+  <w15:commentEx w15:paraId="272051E5" w15:done="1"/>
 </w15:commentsEx>
 </file>
 
@@ -8223,16 +8304,6 @@
 </file>
 
 <file path=word/footer1.xml><?xml version="1.0" encoding="utf-8"?>
-<w:ftr xmlns:wpc="http://schemas.microsoft.com/office/word/2010/wordprocessingCanvas" xmlns:cx="http://schemas.microsoft.com/office/drawing/2014/chartex" xmlns:cx1="http://schemas.microsoft.com/office/drawing/2015/9/8/chartex" xmlns:cx2="http://schemas.microsoft.com/office/drawing/2015/10/21/chartex" xmlns:cx3="http://schemas.microsoft.com/office/drawing/2016/5/9/chartex" xmlns:cx4="http://schemas.microsoft.com/office/drawing/2016/5/10/chartex" xmlns:cx5="http://schemas.microsoft.com/office/drawing/2016/5/11/chartex" xmlns:cx6="http://schemas.microsoft.com/office/drawing/2016/5/12/chartex" xmlns:cx7="http://schemas.microsoft.com/office/drawing/2016/5/13/chartex" xmlns:cx8="http://schemas.microsoft.com/office/drawing/2016/5/14/chartex" xmlns:mc="http://schemas.openxmlformats.org/markup-compatibility/2006" xmlns:aink="http://schemas.microsoft.com/office/drawing/2016/ink" xmlns:am3d="http://schemas.microsoft.com/office/drawing/2017/model3d" xmlns:o="urn:schemas-microsoft-com:office:office" xmlns:oel="http://schemas.microsoft.com/office/2019/extlst" xmlns:r="http://schemas.openxmlformats.org/officeDocument/2006/relationships" xmlns:m="http://schemas.openxmlformats.org/officeDocument/2006/math" xmlns:v="urn:schemas-microsoft-com:vml" xmlns:wp14="http://schemas.microsoft.com/office/word/2010/wordprocessingDrawing" xmlns:wp="http://schemas.openxmlformats.org/drawingml/2006/wordprocessingDrawing" xmlns:w10="urn:schemas-microsoft-com:office:word" xmlns:w="http://schemas.openxmlformats.org/wordprocessingml/2006/main" xmlns:w14="http://schemas.microsoft.com/office/word/2010/wordml" xmlns:w15="http://schemas.microsoft.com/office/word/2012/wordml" xmlns:w16cex="http://schemas.microsoft.com/office/word/2018/wordml/cex" xmlns:w16cid="http://schemas.microsoft.com/office/word/2016/wordml/cid" xmlns:w16="http://schemas.microsoft.com/office/word/2018/wordml" xmlns:w16du="http://schemas.microsoft.com/office/word/2023/wordml/word16du" xmlns:w16sdtdh="http://schemas.microsoft.com/office/word/2020/wordml/sdtdatahash" xmlns:w16sdtfl="http://schemas.microsoft.com/office/word/2024/wordml/sdtformatlock" xmlns:w16se="http://schemas.microsoft.com/office/word/2015/wordml/symex" xmlns:wpg="http://schemas.microsoft.com/office/word/2010/wordprocessingGroup" xmlns:wpi="http://schemas.microsoft.com/office/word/2010/wordprocessingInk" xmlns:wne="http://schemas.microsoft.com/office/word/2006/wordml" xmlns:wps="http://schemas.microsoft.com/office/word/2010/wordprocessingShape" mc:Ignorable="w14 w15 w16se w16cid w16 w16cex w16sdtdh w16sdtfl w16du wp14">
-  <w:p>
-    <w:pPr>
-      <w:pStyle w:val="a5"/>
-    </w:pPr>
-  </w:p>
-</w:ftr>
-</file>
-
-<file path=word/footer2.xml><?xml version="1.0" encoding="utf-8"?>
 <w:ftr xmlns:wpc="http://schemas.microsoft.com/office/word/2010/wordprocessingCanvas" xmlns:cx="http://schemas.microsoft.com/office/drawing/2014/chartex" xmlns:cx1="http://schemas.microsoft.com/office/drawing/2015/9/8/chartex" xmlns:cx2="http://schemas.microsoft.com/office/drawing/2015/10/21/chartex" xmlns:cx3="http://schemas.microsoft.com/office/drawing/2016/5/9/chartex" xmlns:cx4="http://schemas.microsoft.com/office/drawing/2016/5/10/chartex" xmlns:cx5="http://schemas.microsoft.com/office/drawing/2016/5/11/chartex" xmlns:cx6="http://schemas.microsoft.com/office/drawing/2016/5/12/chartex" xmlns:cx7="http://schemas.microsoft.com/office/drawing/2016/5/13/chartex" xmlns:cx8="http://schemas.microsoft.com/office/drawing/2016/5/14/chartex" xmlns:mc="http://schemas.openxmlformats.org/markup-compatibility/2006" xmlns:aink="http://schemas.microsoft.com/office/drawing/2016/ink" xmlns:am3d="http://schemas.microsoft.com/office/drawing/2017/model3d" xmlns:o="urn:schemas-microsoft-com:office:office" xmlns:oel="http://schemas.microsoft.com/office/2019/extlst" xmlns:r="http://schemas.openxmlformats.org/officeDocument/2006/relationships" xmlns:m="http://schemas.openxmlformats.org/officeDocument/2006/math" xmlns:v="urn:schemas-microsoft-com:vml" xmlns:wp14="http://schemas.microsoft.com/office/word/2010/wordprocessingDrawing" xmlns:wp="http://schemas.openxmlformats.org/drawingml/2006/wordprocessingDrawing" xmlns:w10="urn:schemas-microsoft-com:office:word" xmlns:w="http://schemas.openxmlformats.org/wordprocessingml/2006/main" xmlns:w14="http://schemas.microsoft.com/office/word/2010/wordml" xmlns:w15="http://schemas.microsoft.com/office/word/2012/wordml" xmlns:w16cex="http://schemas.microsoft.com/office/word/2018/wordml/cex" xmlns:w16cid="http://schemas.microsoft.com/office/word/2016/wordml/cid" xmlns:w16="http://schemas.microsoft.com/office/word/2018/wordml" xmlns:w16du="http://schemas.microsoft.com/office/word/2023/wordml/word16du" xmlns:w16sdtdh="http://schemas.microsoft.com/office/word/2020/wordml/sdtdatahash" xmlns:w16sdtfl="http://schemas.microsoft.com/office/word/2024/wordml/sdtformatlock" xmlns:w16se="http://schemas.microsoft.com/office/word/2015/wordml/symex" xmlns:wpg="http://schemas.microsoft.com/office/word/2010/wordprocessingGroup" xmlns:wpi="http://schemas.microsoft.com/office/word/2010/wordprocessingInk" xmlns:wne="http://schemas.microsoft.com/office/word/2006/wordml" xmlns:wps="http://schemas.microsoft.com/office/word/2010/wordprocessingShape" mc:Ignorable="w14 w15 w16se w16cid w16 w16cex w16sdtdh w16sdtfl w16du wp14">
   <w:p>
     <w:pPr>
@@ -8274,7 +8345,7 @@
 </w:ftr>
 </file>
 
-<file path=word/footer3.xml><?xml version="1.0" encoding="utf-8"?>
+<file path=word/footer2.xml><?xml version="1.0" encoding="utf-8"?>
 <w:ftr xmlns:wpc="http://schemas.microsoft.com/office/word/2010/wordprocessingCanvas" xmlns:cx="http://schemas.microsoft.com/office/drawing/2014/chartex" xmlns:cx1="http://schemas.microsoft.com/office/drawing/2015/9/8/chartex" xmlns:cx2="http://schemas.microsoft.com/office/drawing/2015/10/21/chartex" xmlns:cx3="http://schemas.microsoft.com/office/drawing/2016/5/9/chartex" xmlns:cx4="http://schemas.microsoft.com/office/drawing/2016/5/10/chartex" xmlns:cx5="http://schemas.microsoft.com/office/drawing/2016/5/11/chartex" xmlns:cx6="http://schemas.microsoft.com/office/drawing/2016/5/12/chartex" xmlns:cx7="http://schemas.microsoft.com/office/drawing/2016/5/13/chartex" xmlns:cx8="http://schemas.microsoft.com/office/drawing/2016/5/14/chartex" xmlns:mc="http://schemas.openxmlformats.org/markup-compatibility/2006" xmlns:aink="http://schemas.microsoft.com/office/drawing/2016/ink" xmlns:am3d="http://schemas.microsoft.com/office/drawing/2017/model3d" xmlns:o="urn:schemas-microsoft-com:office:office" xmlns:oel="http://schemas.microsoft.com/office/2019/extlst" xmlns:r="http://schemas.openxmlformats.org/officeDocument/2006/relationships" xmlns:m="http://schemas.openxmlformats.org/officeDocument/2006/math" xmlns:v="urn:schemas-microsoft-com:vml" xmlns:wp14="http://schemas.microsoft.com/office/word/2010/wordprocessingDrawing" xmlns:wp="http://schemas.openxmlformats.org/drawingml/2006/wordprocessingDrawing" xmlns:w10="urn:schemas-microsoft-com:office:word" xmlns:w="http://schemas.openxmlformats.org/wordprocessingml/2006/main" xmlns:w14="http://schemas.microsoft.com/office/word/2010/wordml" xmlns:w15="http://schemas.microsoft.com/office/word/2012/wordml" xmlns:w16cex="http://schemas.microsoft.com/office/word/2018/wordml/cex" xmlns:w16cid="http://schemas.microsoft.com/office/word/2016/wordml/cid" xmlns:w16="http://schemas.microsoft.com/office/word/2018/wordml" xmlns:w16du="http://schemas.microsoft.com/office/word/2023/wordml/word16du" xmlns:w16sdtdh="http://schemas.microsoft.com/office/word/2020/wordml/sdtdatahash" xmlns:w16sdtfl="http://schemas.microsoft.com/office/word/2024/wordml/sdtformatlock" xmlns:w16se="http://schemas.microsoft.com/office/word/2015/wordml/symex" xmlns:wpg="http://schemas.microsoft.com/office/word/2010/wordprocessingGroup" xmlns:wpi="http://schemas.microsoft.com/office/word/2010/wordprocessingInk" xmlns:wne="http://schemas.microsoft.com/office/word/2006/wordml" xmlns:wps="http://schemas.microsoft.com/office/word/2010/wordprocessingShape" mc:Ignorable="w14 w15 w16se w16cid w16 w16cex w16sdtdh w16sdtfl w16du wp14">
   <w:p>
     <w:pPr>
@@ -8316,7 +8387,7 @@
 </w:ftr>
 </file>
 
-<file path=word/footer4.xml><?xml version="1.0" encoding="utf-8"?>
+<file path=word/footer3.xml><?xml version="1.0" encoding="utf-8"?>
 <w:ftr xmlns:wpc="http://schemas.microsoft.com/office/word/2010/wordprocessingCanvas" xmlns:cx="http://schemas.microsoft.com/office/drawing/2014/chartex" xmlns:cx1="http://schemas.microsoft.com/office/drawing/2015/9/8/chartex" xmlns:cx2="http://schemas.microsoft.com/office/drawing/2015/10/21/chartex" xmlns:cx3="http://schemas.microsoft.com/office/drawing/2016/5/9/chartex" xmlns:cx4="http://schemas.microsoft.com/office/drawing/2016/5/10/chartex" xmlns:cx5="http://schemas.microsoft.com/office/drawing/2016/5/11/chartex" xmlns:cx6="http://schemas.microsoft.com/office/drawing/2016/5/12/chartex" xmlns:cx7="http://schemas.microsoft.com/office/drawing/2016/5/13/chartex" xmlns:cx8="http://schemas.microsoft.com/office/drawing/2016/5/14/chartex" xmlns:mc="http://schemas.openxmlformats.org/markup-compatibility/2006" xmlns:aink="http://schemas.microsoft.com/office/drawing/2016/ink" xmlns:am3d="http://schemas.microsoft.com/office/drawing/2017/model3d" xmlns:o="urn:schemas-microsoft-com:office:office" xmlns:oel="http://schemas.microsoft.com/office/2019/extlst" xmlns:r="http://schemas.openxmlformats.org/officeDocument/2006/relationships" xmlns:m="http://schemas.openxmlformats.org/officeDocument/2006/math" xmlns:v="urn:schemas-microsoft-com:vml" xmlns:wp14="http://schemas.microsoft.com/office/word/2010/wordprocessingDrawing" xmlns:wp="http://schemas.openxmlformats.org/drawingml/2006/wordprocessingDrawing" xmlns:w10="urn:schemas-microsoft-com:office:word" xmlns:w="http://schemas.openxmlformats.org/wordprocessingml/2006/main" xmlns:w14="http://schemas.microsoft.com/office/word/2010/wordml" xmlns:w15="http://schemas.microsoft.com/office/word/2012/wordml" xmlns:w16cex="http://schemas.microsoft.com/office/word/2018/wordml/cex" xmlns:w16cid="http://schemas.microsoft.com/office/word/2016/wordml/cid" xmlns:w16="http://schemas.microsoft.com/office/word/2018/wordml" xmlns:w16du="http://schemas.microsoft.com/office/word/2023/wordml/word16du" xmlns:w16sdtdh="http://schemas.microsoft.com/office/word/2020/wordml/sdtdatahash" xmlns:w16sdtfl="http://schemas.microsoft.com/office/word/2024/wordml/sdtformatlock" xmlns:w16se="http://schemas.microsoft.com/office/word/2015/wordml/symex" xmlns:wpg="http://schemas.microsoft.com/office/word/2010/wordprocessingGroup" xmlns:wpi="http://schemas.microsoft.com/office/word/2010/wordprocessingInk" xmlns:wne="http://schemas.microsoft.com/office/word/2006/wordml" xmlns:wps="http://schemas.microsoft.com/office/word/2010/wordprocessingShape" mc:Ignorable="w14 w15 w16se w16cid w16 w16cex w16sdtdh w16sdtfl w16du wp14">
   <w:p>
     <w:pPr>
@@ -8374,16 +8445,6 @@
 </file>
 
 <file path=word/header1.xml><?xml version="1.0" encoding="utf-8"?>
-<w:hdr xmlns:wpc="http://schemas.microsoft.com/office/word/2010/wordprocessingCanvas" xmlns:cx="http://schemas.microsoft.com/office/drawing/2014/chartex" xmlns:cx1="http://schemas.microsoft.com/office/drawing/2015/9/8/chartex" xmlns:cx2="http://schemas.microsoft.com/office/drawing/2015/10/21/chartex" xmlns:cx3="http://schemas.microsoft.com/office/drawing/2016/5/9/chartex" xmlns:cx4="http://schemas.microsoft.com/office/drawing/2016/5/10/chartex" xmlns:cx5="http://schemas.microsoft.com/office/drawing/2016/5/11/chartex" xmlns:cx6="http://schemas.microsoft.com/office/drawing/2016/5/12/chartex" xmlns:cx7="http://schemas.microsoft.com/office/drawing/2016/5/13/chartex" xmlns:cx8="http://schemas.microsoft.com/office/drawing/2016/5/14/chartex" xmlns:mc="http://schemas.openxmlformats.org/markup-compatibility/2006" xmlns:aink="http://schemas.microsoft.com/office/drawing/2016/ink" xmlns:am3d="http://schemas.microsoft.com/office/drawing/2017/model3d" xmlns:o="urn:schemas-microsoft-com:office:office" xmlns:oel="http://schemas.microsoft.com/office/2019/extlst" xmlns:r="http://schemas.openxmlformats.org/officeDocument/2006/relationships" xmlns:m="http://schemas.openxmlformats.org/officeDocument/2006/math" xmlns:v="urn:schemas-microsoft-com:vml" xmlns:wp14="http://schemas.microsoft.com/office/word/2010/wordprocessingDrawing" xmlns:wp="http://schemas.openxmlformats.org/drawingml/2006/wordprocessingDrawing" xmlns:w10="urn:schemas-microsoft-com:office:word" xmlns:w="http://schemas.openxmlformats.org/wordprocessingml/2006/main" xmlns:w14="http://schemas.microsoft.com/office/word/2010/wordml" xmlns:w15="http://schemas.microsoft.com/office/word/2012/wordml" xmlns:w16cex="http://schemas.microsoft.com/office/word/2018/wordml/cex" xmlns:w16cid="http://schemas.microsoft.com/office/word/2016/wordml/cid" xmlns:w16="http://schemas.microsoft.com/office/word/2018/wordml" xmlns:w16du="http://schemas.microsoft.com/office/word/2023/wordml/word16du" xmlns:w16sdtdh="http://schemas.microsoft.com/office/word/2020/wordml/sdtdatahash" xmlns:w16sdtfl="http://schemas.microsoft.com/office/word/2024/wordml/sdtformatlock" xmlns:w16se="http://schemas.microsoft.com/office/word/2015/wordml/symex" xmlns:wpg="http://schemas.microsoft.com/office/word/2010/wordprocessingGroup" xmlns:wpi="http://schemas.microsoft.com/office/word/2010/wordprocessingInk" xmlns:wne="http://schemas.microsoft.com/office/word/2006/wordml" xmlns:wps="http://schemas.microsoft.com/office/word/2010/wordprocessingShape" mc:Ignorable="w14 w15 w16se w16cid w16 w16cex w16sdtdh w16sdtfl w16du wp14">
-  <w:p>
-    <w:pPr>
-      <w:pStyle w:val="a3"/>
-    </w:pPr>
-  </w:p>
-</w:hdr>
-</file>
-
-<file path=word/header2.xml><?xml version="1.0" encoding="utf-8"?>
 <w:hdr xmlns:wpc="http://schemas.microsoft.com/office/word/2010/wordprocessingCanvas" xmlns:cx="http://schemas.microsoft.com/office/drawing/2014/chartex" xmlns:cx1="http://schemas.microsoft.com/office/drawing/2015/9/8/chartex" xmlns:cx2="http://schemas.microsoft.com/office/drawing/2015/10/21/chartex" xmlns:cx3="http://schemas.microsoft.com/office/drawing/2016/5/9/chartex" xmlns:cx4="http://schemas.microsoft.com/office/drawing/2016/5/10/chartex" xmlns:cx5="http://schemas.microsoft.com/office/drawing/2016/5/11/chartex" xmlns:cx6="http://schemas.microsoft.com/office/drawing/2016/5/12/chartex" xmlns:cx7="http://schemas.microsoft.com/office/drawing/2016/5/13/chartex" xmlns:cx8="http://schemas.microsoft.com/office/drawing/2016/5/14/chartex" xmlns:mc="http://schemas.openxmlformats.org/markup-compatibility/2006" xmlns:aink="http://schemas.microsoft.com/office/drawing/2016/ink" xmlns:am3d="http://schemas.microsoft.com/office/drawing/2017/model3d" xmlns:o="urn:schemas-microsoft-com:office:office" xmlns:oel="http://schemas.microsoft.com/office/2019/extlst" xmlns:r="http://schemas.openxmlformats.org/officeDocument/2006/relationships" xmlns:m="http://schemas.openxmlformats.org/officeDocument/2006/math" xmlns:v="urn:schemas-microsoft-com:vml" xmlns:wp14="http://schemas.microsoft.com/office/word/2010/wordprocessingDrawing" xmlns:wp="http://schemas.openxmlformats.org/drawingml/2006/wordprocessingDrawing" xmlns:w10="urn:schemas-microsoft-com:office:word" xmlns:w="http://schemas.openxmlformats.org/wordprocessingml/2006/main" xmlns:w14="http://schemas.microsoft.com/office/word/2010/wordml" xmlns:w15="http://schemas.microsoft.com/office/word/2012/wordml" xmlns:w16cex="http://schemas.microsoft.com/office/word/2018/wordml/cex" xmlns:w16cid="http://schemas.microsoft.com/office/word/2016/wordml/cid" xmlns:w16="http://schemas.microsoft.com/office/word/2018/wordml" xmlns:w16du="http://schemas.microsoft.com/office/word/2023/wordml/word16du" xmlns:w16sdtdh="http://schemas.microsoft.com/office/word/2020/wordml/sdtdatahash" xmlns:w16sdtfl="http://schemas.microsoft.com/office/word/2024/wordml/sdtformatlock" xmlns:w16se="http://schemas.microsoft.com/office/word/2015/wordml/symex" xmlns:wpg="http://schemas.microsoft.com/office/word/2010/wordprocessingGroup" xmlns:wpi="http://schemas.microsoft.com/office/word/2010/wordprocessingInk" xmlns:wne="http://schemas.microsoft.com/office/word/2006/wordml" xmlns:wps="http://schemas.microsoft.com/office/word/2010/wordprocessingShape" mc:Ignorable="w14 w15 w16se w16cid w16 w16cex w16sdtdh w16sdtfl w16du wp14">
   <w:p>
     <w:pPr>
@@ -8468,7 +8529,7 @@
 </w:hdr>
 </file>
 
-<file path=word/header3.xml><?xml version="1.0" encoding="utf-8"?>
+<file path=word/header2.xml><?xml version="1.0" encoding="utf-8"?>
 <w:hdr xmlns:wpc="http://schemas.microsoft.com/office/word/2010/wordprocessingCanvas" xmlns:cx="http://schemas.microsoft.com/office/drawing/2014/chartex" xmlns:cx1="http://schemas.microsoft.com/office/drawing/2015/9/8/chartex" xmlns:cx2="http://schemas.microsoft.com/office/drawing/2015/10/21/chartex" xmlns:cx3="http://schemas.microsoft.com/office/drawing/2016/5/9/chartex" xmlns:cx4="http://schemas.microsoft.com/office/drawing/2016/5/10/chartex" xmlns:cx5="http://schemas.microsoft.com/office/drawing/2016/5/11/chartex" xmlns:cx6="http://schemas.microsoft.com/office/drawing/2016/5/12/chartex" xmlns:cx7="http://schemas.microsoft.com/office/drawing/2016/5/13/chartex" xmlns:cx8="http://schemas.microsoft.com/office/drawing/2016/5/14/chartex" xmlns:mc="http://schemas.openxmlformats.org/markup-compatibility/2006" xmlns:aink="http://schemas.microsoft.com/office/drawing/2016/ink" xmlns:am3d="http://schemas.microsoft.com/office/drawing/2017/model3d" xmlns:o="urn:schemas-microsoft-com:office:office" xmlns:oel="http://schemas.microsoft.com/office/2019/extlst" xmlns:r="http://schemas.openxmlformats.org/officeDocument/2006/relationships" xmlns:m="http://schemas.openxmlformats.org/officeDocument/2006/math" xmlns:v="urn:schemas-microsoft-com:vml" xmlns:wp14="http://schemas.microsoft.com/office/word/2010/wordprocessingDrawing" xmlns:wp="http://schemas.openxmlformats.org/drawingml/2006/wordprocessingDrawing" xmlns:w10="urn:schemas-microsoft-com:office:word" xmlns:w="http://schemas.openxmlformats.org/wordprocessingml/2006/main" xmlns:w14="http://schemas.microsoft.com/office/word/2010/wordml" xmlns:w15="http://schemas.microsoft.com/office/word/2012/wordml" xmlns:w16cex="http://schemas.microsoft.com/office/word/2018/wordml/cex" xmlns:w16cid="http://schemas.microsoft.com/office/word/2016/wordml/cid" xmlns:w16="http://schemas.microsoft.com/office/word/2018/wordml" xmlns:w16du="http://schemas.microsoft.com/office/word/2023/wordml/word16du" xmlns:w16sdtdh="http://schemas.microsoft.com/office/word/2020/wordml/sdtdatahash" xmlns:w16sdtfl="http://schemas.microsoft.com/office/word/2024/wordml/sdtformatlock" xmlns:w16se="http://schemas.microsoft.com/office/word/2015/wordml/symex" xmlns:wpg="http://schemas.microsoft.com/office/word/2010/wordprocessingGroup" xmlns:wpi="http://schemas.microsoft.com/office/word/2010/wordprocessingInk" xmlns:wne="http://schemas.microsoft.com/office/word/2006/wordml" xmlns:wps="http://schemas.microsoft.com/office/word/2010/wordprocessingShape" mc:Ignorable="w14 w15 w16se w16cid w16 w16cex w16sdtdh w16sdtfl w16du wp14">
   <w:p>
     <w:pPr>
@@ -13024,6 +13085,9 @@
 
 <file path=word/people.xml><?xml version="1.0" encoding="utf-8"?>
 <w15:people xmlns:wpc="http://schemas.microsoft.com/office/word/2010/wordprocessingCanvas" xmlns:cx="http://schemas.microsoft.com/office/drawing/2014/chartex" xmlns:cx1="http://schemas.microsoft.com/office/drawing/2015/9/8/chartex" xmlns:cx2="http://schemas.microsoft.com/office/drawing/2015/10/21/chartex" xmlns:cx3="http://schemas.microsoft.com/office/drawing/2016/5/9/chartex" xmlns:cx4="http://schemas.microsoft.com/office/drawing/2016/5/10/chartex" xmlns:cx5="http://schemas.microsoft.com/office/drawing/2016/5/11/chartex" xmlns:cx6="http://schemas.microsoft.com/office/drawing/2016/5/12/chartex" xmlns:cx7="http://schemas.microsoft.com/office/drawing/2016/5/13/chartex" xmlns:cx8="http://schemas.microsoft.com/office/drawing/2016/5/14/chartex" xmlns:mc="http://schemas.openxmlformats.org/markup-compatibility/2006" xmlns:aink="http://schemas.microsoft.com/office/drawing/2016/ink" xmlns:am3d="http://schemas.microsoft.com/office/drawing/2017/model3d" xmlns:o="urn:schemas-microsoft-com:office:office" xmlns:oel="http://schemas.microsoft.com/office/2019/extlst" xmlns:r="http://schemas.openxmlformats.org/officeDocument/2006/relationships" xmlns:m="http://schemas.openxmlformats.org/officeDocument/2006/math" xmlns:v="urn:schemas-microsoft-com:vml" xmlns:wp14="http://schemas.microsoft.com/office/word/2010/wordprocessingDrawing" xmlns:wp="http://schemas.openxmlformats.org/drawingml/2006/wordprocessingDrawing" xmlns:w10="urn:schemas-microsoft-com:office:word" xmlns:w="http://schemas.openxmlformats.org/wordprocessingml/2006/main" xmlns:w14="http://schemas.microsoft.com/office/word/2010/wordml" xmlns:w15="http://schemas.microsoft.com/office/word/2012/wordml" xmlns:w16cex="http://schemas.microsoft.com/office/word/2018/wordml/cex" xmlns:w16cid="http://schemas.microsoft.com/office/word/2016/wordml/cid" xmlns:w16="http://schemas.microsoft.com/office/word/2018/wordml" xmlns:w16du="http://schemas.microsoft.com/office/word/2023/wordml/word16du" xmlns:w16sdtdh="http://schemas.microsoft.com/office/word/2020/wordml/sdtdatahash" xmlns:w16sdtfl="http://schemas.microsoft.com/office/word/2024/wordml/sdtformatlock" xmlns:w16se="http://schemas.microsoft.com/office/word/2015/wordml/symex" xmlns:wpg="http://schemas.microsoft.com/office/word/2010/wordprocessingGroup" xmlns:wpi="http://schemas.microsoft.com/office/word/2010/wordprocessingInk" xmlns:wne="http://schemas.microsoft.com/office/word/2006/wordml" xmlns:wps="http://schemas.microsoft.com/office/word/2010/wordprocessingShape" mc:Ignorable="w14 w15 w16se w16cid w16 w16cex w16sdtdh w16sdtfl w16du wp14">
+  <w15:person w15:author="Henry Fung">
+    <w15:presenceInfo w15:providerId="Windows Live" w15:userId="608d9d874fd54fd1"/>
+  </w15:person>
   <w15:person w15:author="Jervin NG">
     <w15:presenceInfo w15:providerId="AD" w15:userId="S::jervinngls@hkbu.edu.hk::2ef1def1-14c1-4020-86a4-293e4ee8aa56"/>
   </w15:person>
@@ -14081,10 +14145,31 @@
 </file>
 
 <file path=customXml/item1.xml><?xml version="1.0" encoding="utf-8"?>
+<?mso-contentType ?>
+<FormTemplates xmlns="http://schemas.microsoft.com/sharepoint/v3/contenttype/forms">
+  <Display>DocumentLibraryForm</Display>
+  <Edit>DocumentLibraryForm</Edit>
+  <New>DocumentLibraryForm</New>
+</FormTemplates>
+</file>
+
+<file path=customXml/item2.xml><?xml version="1.0" encoding="utf-8"?>
+<p:properties xmlns:p="http://schemas.microsoft.com/office/2006/metadata/properties" xmlns:xsi="http://www.w3.org/2001/XMLSchema-instance" xmlns:pc="http://schemas.microsoft.com/office/infopath/2007/PartnerControls">
+  <documentManagement>
+    <TaxCatchAll xmlns="5a7eadf7-2b1c-4a5a-97a9-adafd1c04f06" xsi:nil="true"/>
+    <Test_option xmlns="19187dac-df12-4571-8d4c-1f93d22bc1fc" xsi:nil="true"/>
+    <lcf76f155ced4ddcb4097134ff3c332f xmlns="19187dac-df12-4571-8d4c-1f93d22bc1fc">
+      <Terms xmlns="http://schemas.microsoft.com/office/infopath/2007/PartnerControls"/>
+    </lcf76f155ced4ddcb4097134ff3c332f>
+  </documentManagement>
+</p:properties>
+</file>
+
+<file path=customXml/item3.xml><?xml version="1.0" encoding="utf-8"?>
 <b:Sources xmlns:b="http://schemas.openxmlformats.org/officeDocument/2006/bibliography" xmlns="http://schemas.openxmlformats.org/officeDocument/2006/bibliography" SelectedStyle="\APA.XSL" StyleName="APA"/>
 </file>
 
-<file path=customXml/item2.xml><?xml version="1.0" encoding="utf-8"?>
+<file path=customXml/item4.xml><?xml version="1.0" encoding="utf-8"?>
 <ct:contentTypeSchema xmlns:ct="http://schemas.microsoft.com/office/2006/metadata/contentType" xmlns:ma="http://schemas.microsoft.com/office/2006/metadata/properties/metaAttributes" ct:_="" ma:_="" ma:contentTypeName="Document" ma:contentTypeID="0x010100570AC14696B9334B8107905EF8DA8D2B" ma:contentTypeVersion="17" ma:contentTypeDescription="Create a new document." ma:contentTypeScope="" ma:versionID="f14dc457a3a52cbedb6971b95db0e912">
   <xsd:schema xmlns:xsd="http://www.w3.org/2001/XMLSchema" xmlns:xs="http://www.w3.org/2001/XMLSchema" xmlns:p="http://schemas.microsoft.com/office/2006/metadata/properties" xmlns:ns2="19187dac-df12-4571-8d4c-1f93d22bc1fc" xmlns:ns3="5a7eadf7-2b1c-4a5a-97a9-adafd1c04f06" targetNamespace="http://schemas.microsoft.com/office/2006/metadata/properties" ma:root="true" ma:fieldsID="48ab5d3334d14a6e5f30fbc404b13d53" ns2:_="" ns3:_="">
     <xsd:import namespace="19187dac-df12-4571-8d4c-1f93d22bc1fc"/>
@@ -14334,28 +14419,26 @@
 </ct:contentTypeSchema>
 </file>
 
-<file path=customXml/item3.xml><?xml version="1.0" encoding="utf-8"?>
-<?mso-contentType ?>
-<FormTemplates xmlns="http://schemas.microsoft.com/sharepoint/v3/contenttype/forms">
-  <Display>DocumentLibraryForm</Display>
-  <Edit>DocumentLibraryForm</Edit>
-  <New>DocumentLibraryForm</New>
-</FormTemplates>
+<file path=customXml/itemProps1.xml><?xml version="1.0" encoding="utf-8"?>
+<ds:datastoreItem xmlns:ds="http://schemas.openxmlformats.org/officeDocument/2006/customXml" ds:itemID="{6465E9C1-9834-467F-8A90-445251FD291D}">
+  <ds:schemaRefs>
+    <ds:schemaRef ds:uri="http://schemas.microsoft.com/sharepoint/v3/contenttype/forms"/>
+  </ds:schemaRefs>
+</ds:datastoreItem>
 </file>
 
-<file path=customXml/item4.xml><?xml version="1.0" encoding="utf-8"?>
-<p:properties xmlns:p="http://schemas.microsoft.com/office/2006/metadata/properties" xmlns:xsi="http://www.w3.org/2001/XMLSchema-instance" xmlns:pc="http://schemas.microsoft.com/office/infopath/2007/PartnerControls">
-  <documentManagement>
-    <TaxCatchAll xmlns="5a7eadf7-2b1c-4a5a-97a9-adafd1c04f06" xsi:nil="true"/>
-    <Test_option xmlns="19187dac-df12-4571-8d4c-1f93d22bc1fc" xsi:nil="true"/>
-    <lcf76f155ced4ddcb4097134ff3c332f xmlns="19187dac-df12-4571-8d4c-1f93d22bc1fc">
-      <Terms xmlns="http://schemas.microsoft.com/office/infopath/2007/PartnerControls"/>
-    </lcf76f155ced4ddcb4097134ff3c332f>
-  </documentManagement>
-</p:properties>
+<file path=customXml/itemProps2.xml><?xml version="1.0" encoding="utf-8"?>
+<ds:datastoreItem xmlns:ds="http://schemas.openxmlformats.org/officeDocument/2006/customXml" ds:itemID="{4889114F-00B7-45F7-AE28-897250D757B9}">
+  <ds:schemaRefs>
+    <ds:schemaRef ds:uri="http://schemas.microsoft.com/office/2006/metadata/properties"/>
+    <ds:schemaRef ds:uri="http://schemas.microsoft.com/office/infopath/2007/PartnerControls"/>
+    <ds:schemaRef ds:uri="5a7eadf7-2b1c-4a5a-97a9-adafd1c04f06"/>
+    <ds:schemaRef ds:uri="19187dac-df12-4571-8d4c-1f93d22bc1fc"/>
+  </ds:schemaRefs>
+</ds:datastoreItem>
 </file>
 
-<file path=customXml/itemProps1.xml><?xml version="1.0" encoding="utf-8"?>
+<file path=customXml/itemProps3.xml><?xml version="1.0" encoding="utf-8"?>
 <ds:datastoreItem xmlns:ds="http://schemas.openxmlformats.org/officeDocument/2006/customXml" ds:itemID="{B6C790D6-632D-40D1-82B2-2BA804518A72}">
   <ds:schemaRefs>
     <ds:schemaRef ds:uri="http://schemas.openxmlformats.org/officeDocument/2006/bibliography"/>
@@ -14363,7 +14446,7 @@
 </ds:datastoreItem>
 </file>
 
-<file path=customXml/itemProps2.xml><?xml version="1.0" encoding="utf-8"?>
+<file path=customXml/itemProps4.xml><?xml version="1.0" encoding="utf-8"?>
 <ds:datastoreItem xmlns:ds="http://schemas.openxmlformats.org/officeDocument/2006/customXml" ds:itemID="{0500175E-B7E1-4F66-857E-8CCD3DCE3C2F}">
   <ds:schemaRefs>
     <ds:schemaRef ds:uri="http://schemas.microsoft.com/office/2006/metadata/contentType"/>
@@ -14380,23 +14463,4 @@
     <ds:schemaRef ds:uri="http://schemas.microsoft.com/internal/obd"/>
   </ds:schemaRefs>
 </ds:datastoreItem>
-</file>
-
-<file path=customXml/itemProps3.xml><?xml version="1.0" encoding="utf-8"?>
-<ds:datastoreItem xmlns:ds="http://schemas.openxmlformats.org/officeDocument/2006/customXml" ds:itemID="{6465E9C1-9834-467F-8A90-445251FD291D}">
-  <ds:schemaRefs>
-    <ds:schemaRef ds:uri="http://schemas.microsoft.com/sharepoint/v3/contenttype/forms"/>
-  </ds:schemaRefs>
-</ds:datastoreItem>
-</file>
-
-<file path=customXml/itemProps4.xml><?xml version="1.0" encoding="utf-8"?>
-<ds:datastoreItem xmlns:ds="http://schemas.openxmlformats.org/officeDocument/2006/customXml" ds:itemID="{4889114F-00B7-45F7-AE28-897250D757B9}">
-  <ds:schemaRefs>
-    <ds:schemaRef ds:uri="http://schemas.microsoft.com/office/2006/metadata/properties"/>
-    <ds:schemaRef ds:uri="http://schemas.microsoft.com/office/infopath/2007/PartnerControls"/>
-    <ds:schemaRef ds:uri="5a7eadf7-2b1c-4a5a-97a9-adafd1c04f06"/>
-    <ds:schemaRef ds:uri="19187dac-df12-4571-8d4c-1f93d22bc1fc"/>
-  </ds:schemaRefs>
-</ds:datastoreItem>
 </file>
</xml_diff>